<commit_message>
Replacing bookmarks almost done. Refactor project structure
</commit_message>
<xml_diff>
--- a/templates/flat_card.docx
+++ b/templates/flat_card.docx
@@ -16,15 +16,15 @@
         </w:tblCellMar>
       </w:tblPr>
       <w:tblGrid>
-        <w:gridCol w:w="4080"/>
-        <w:gridCol w:w="2545"/>
+        <w:gridCol w:w="4075"/>
+        <w:gridCol w:w="2550"/>
         <w:gridCol w:w="3013"/>
       </w:tblGrid>
       <w:tr>
         <w:trPr/>
         <w:tc>
           <w:tcPr>
-            <w:tcW w:w="4080" w:type="dxa"/>
+            <w:tcW w:w="4075" w:type="dxa"/>
             <w:tcBorders>
               <w:top w:val="single" w:sz="4" w:space="0" w:color="000000"/>
               <w:start w:val="single" w:sz="4" w:space="0" w:color="000000"/>
@@ -33,7 +33,7 @@
           </w:tcPr>
           <w:p>
             <w:pPr>
-              <w:pStyle w:val="Style16"/>
+              <w:pStyle w:val="user2"/>
               <w:bidi w:val="0"/>
               <w:spacing w:lineRule="auto" w:line="240"/>
               <w:jc w:val="center"/>
@@ -45,7 +45,7 @@
             </w:pPr>
             <w:r>
               <w:drawing>
-                <wp:anchor distT="0" distB="0" distL="0" distR="0" simplePos="0" relativeHeight="2" behindDoc="0" locked="0" layoutInCell="0" allowOverlap="1">
+                <wp:anchor distT="0" distB="0" distL="0" distR="0" simplePos="0" relativeHeight="2" behindDoc="0" locked="0" layoutInCell="1" allowOverlap="1">
                   <wp:simplePos x="0" y="0"/>
                   <wp:positionH relativeFrom="column">
                     <wp:align>center</wp:align>
@@ -102,7 +102,7 @@
           </w:p>
           <w:p>
             <w:pPr>
-              <w:pStyle w:val="Style16"/>
+              <w:pStyle w:val="user2"/>
               <w:bidi w:val="0"/>
               <w:spacing w:lineRule="auto" w:line="240"/>
               <w:jc w:val="center"/>
@@ -135,7 +135,7 @@
           </w:p>
           <w:p>
             <w:pPr>
-              <w:pStyle w:val="Style16"/>
+              <w:pStyle w:val="user2"/>
               <w:bidi w:val="0"/>
               <w:spacing w:lineRule="auto" w:line="240"/>
               <w:jc w:val="center"/>
@@ -156,7 +156,7 @@
           </w:p>
           <w:p>
             <w:pPr>
-              <w:pStyle w:val="Style16"/>
+              <w:pStyle w:val="user2"/>
               <w:bidi w:val="0"/>
               <w:spacing w:lineRule="auto" w:line="240"/>
               <w:jc w:val="center"/>
@@ -177,7 +177,7 @@
           </w:p>
           <w:p>
             <w:pPr>
-              <w:pStyle w:val="Style16"/>
+              <w:pStyle w:val="user2"/>
               <w:bidi w:val="0"/>
               <w:spacing w:lineRule="auto" w:line="240"/>
               <w:jc w:val="center"/>
@@ -198,7 +198,7 @@
           </w:p>
           <w:p>
             <w:pPr>
-              <w:pStyle w:val="Style16"/>
+              <w:pStyle w:val="user2"/>
               <w:bidi w:val="0"/>
               <w:spacing w:lineRule="auto" w:line="240"/>
               <w:jc w:val="center"/>
@@ -219,7 +219,7 @@
           </w:p>
           <w:p>
             <w:pPr>
-              <w:pStyle w:val="Style16"/>
+              <w:pStyle w:val="user2"/>
               <w:bidi w:val="0"/>
               <w:spacing w:lineRule="auto" w:line="240"/>
               <w:jc w:val="center"/>
@@ -251,7 +251,7 @@
           </w:p>
           <w:p>
             <w:pPr>
-              <w:pStyle w:val="Style16"/>
+              <w:pStyle w:val="user2"/>
               <w:bidi w:val="0"/>
               <w:spacing w:lineRule="auto" w:line="240"/>
               <w:jc w:val="center"/>
@@ -274,7 +274,7 @@
           </w:p>
           <w:p>
             <w:pPr>
-              <w:pStyle w:val="Style16"/>
+              <w:pStyle w:val="user2"/>
               <w:bidi w:val="0"/>
               <w:spacing w:lineRule="auto" w:line="240"/>
               <w:jc w:val="center"/>
@@ -297,17 +297,48 @@
           </w:p>
           <w:p>
             <w:pPr>
-              <w:pStyle w:val="Style16"/>
+              <w:pStyle w:val="user2"/>
               <w:bidi w:val="0"/>
               <w:spacing w:lineRule="auto" w:line="240"/>
               <w:jc w:val="center"/>
               <w:rPr>
                 <w:rFonts w:ascii="Times New Roman" w:hAnsi="Times New Roman"/>
-                <w:sz w:val="24"/>
-                <w:szCs w:val="24"/>
+                <w:sz w:val="20"/>
+                <w:szCs w:val="20"/>
+                <w:u w:val="none"/>
+                <w:lang w:val="ru-RU"/>
+              </w:rPr>
+            </w:pPr>
+            <w:r>
+              <w:rPr>
+                <w:rFonts w:eastAsia="NSimSun" w:cs="Lucida Sans" w:ascii="Times New Roman" w:hAnsi="Times New Roman"/>
+                <w:color w:val="auto"/>
+                <w:kern w:val="2"/>
+                <w:sz w:val="24"/>
+                <w:szCs w:val="24"/>
+                <w:u w:val="single"/>
+                <w:lang w:eastAsia="zh-CN" w:bidi="hi-IN"/>
+              </w:rPr>
+              <w:t>{{дата}}</w:t>
+            </w:r>
+            <w:r>
+              <w:rPr>
+                <w:rFonts w:ascii="Times New Roman" w:hAnsi="Times New Roman"/>
+                <w:sz w:val="20"/>
+                <w:szCs w:val="20"/>
                 <w:lang w:val="en-US"/>
               </w:rPr>
-            </w:pPr>
+              <w:t xml:space="preserve"> </w:t>
+            </w:r>
+            <w:r>
+              <w:rPr>
+                <w:rFonts w:ascii="Times New Roman" w:hAnsi="Times New Roman"/>
+                <w:sz w:val="24"/>
+                <w:szCs w:val="24"/>
+                <w:lang w:val="ru-RU"/>
+              </w:rPr>
+              <w:t xml:space="preserve">№ </w:t>
+            </w:r>
             <w:r>
               <w:rPr>
                 <w:rFonts w:ascii="Times New Roman" w:hAnsi="Times New Roman"/>
@@ -326,7 +357,7 @@
                 <w:u w:val="single"/>
                 <w:lang w:val="ru-RU"/>
               </w:rPr>
-              <w:t>дата</w:t>
+              <w:t>номер_верхний</w:t>
             </w:r>
             <w:r>
               <w:rPr>
@@ -338,32 +369,50 @@
               </w:rPr>
               <w:t>}}</w:t>
             </w:r>
-            <w:r>
-              <w:rPr>
-                <w:rFonts w:ascii="Times New Roman" w:hAnsi="Times New Roman"/>
-                <w:sz w:val="24"/>
-                <w:szCs w:val="24"/>
-                <w:lang w:val="en-US"/>
-              </w:rPr>
-              <w:t xml:space="preserve"> </w:t>
-            </w:r>
-            <w:r>
-              <w:rPr>
-                <w:rFonts w:ascii="Times New Roman" w:hAnsi="Times New Roman"/>
-                <w:sz w:val="24"/>
-                <w:szCs w:val="24"/>
-                <w:lang w:val="ru-RU"/>
-              </w:rPr>
-              <w:t xml:space="preserve">№ </w:t>
-            </w:r>
-            <w:r>
-              <w:rPr>
-                <w:rFonts w:ascii="Times New Roman" w:hAnsi="Times New Roman"/>
+          </w:p>
+          <w:p>
+            <w:pPr>
+              <w:pStyle w:val="user2"/>
+              <w:bidi w:val="0"/>
+              <w:spacing w:lineRule="auto" w:line="240"/>
+              <w:jc w:val="center"/>
+              <w:rPr>
+                <w:rFonts w:ascii="Times New Roman" w:hAnsi="Times New Roman"/>
+                <w:i w:val="false"/>
+                <w:iCs w:val="false"/>
                 <w:sz w:val="24"/>
                 <w:szCs w:val="24"/>
                 <w:u w:val="single"/>
                 <w:lang w:val="en-US"/>
               </w:rPr>
+            </w:pPr>
+            <w:r>
+              <w:rPr>
+                <w:rFonts w:ascii="Times New Roman" w:hAnsi="Times New Roman"/>
+                <w:sz w:val="24"/>
+                <w:szCs w:val="24"/>
+                <w:lang w:val="ru-RU"/>
+              </w:rPr>
+              <w:t>№</w:t>
+            </w:r>
+            <w:r>
+              <w:rPr>
+                <w:rFonts w:ascii="Times New Roman" w:hAnsi="Times New Roman"/>
+                <w:sz w:val="24"/>
+                <w:szCs w:val="24"/>
+                <w:u w:val="none"/>
+                <w:lang w:val="ru-RU"/>
+              </w:rPr>
+              <w:t xml:space="preserve"> </w:t>
+            </w:r>
+            <w:r>
+              <w:rPr>
+                <w:rFonts w:ascii="Times New Roman" w:hAnsi="Times New Roman"/>
+                <w:sz w:val="24"/>
+                <w:szCs w:val="24"/>
+                <w:u w:val="single"/>
+                <w:lang w:val="en-US"/>
+              </w:rPr>
               <w:t>{{</w:t>
             </w:r>
             <w:r>
@@ -374,7 +423,7 @@
                 <w:u w:val="single"/>
                 <w:lang w:val="ru-RU"/>
               </w:rPr>
-              <w:t>номер_верхний</w:t>
+              <w:t>номер_нижний</w:t>
             </w:r>
             <w:r>
               <w:rPr>
@@ -386,32 +435,23 @@
               </w:rPr>
               <w:t>}}</w:t>
             </w:r>
-          </w:p>
-          <w:p>
-            <w:pPr>
-              <w:pStyle w:val="Style16"/>
-              <w:bidi w:val="0"/>
-              <w:spacing w:lineRule="auto" w:line="240"/>
-              <w:jc w:val="center"/>
-              <w:rPr>
-                <w:rFonts w:ascii="Times New Roman" w:hAnsi="Times New Roman"/>
-                <w:sz w:val="24"/>
-                <w:szCs w:val="24"/>
+            <w:r>
+              <w:rPr>
+                <w:rFonts w:ascii="Times New Roman" w:hAnsi="Times New Roman"/>
+                <w:i w:val="false"/>
+                <w:iCs w:val="false"/>
+                <w:sz w:val="24"/>
+                <w:szCs w:val="24"/>
+                <w:u w:val="none"/>
                 <w:lang w:val="ru-RU"/>
               </w:rPr>
-            </w:pPr>
-            <w:r>
-              <w:rPr>
-                <w:rFonts w:ascii="Times New Roman" w:hAnsi="Times New Roman"/>
-                <w:sz w:val="24"/>
-                <w:szCs w:val="24"/>
-                <w:lang w:val="ru-RU"/>
-              </w:rPr>
-              <w:t xml:space="preserve">№ </w:t>
-            </w:r>
-            <w:r>
-              <w:rPr>
-                <w:rFonts w:ascii="Times New Roman" w:hAnsi="Times New Roman"/>
+              <w:t xml:space="preserve"> от </w:t>
+            </w:r>
+            <w:r>
+              <w:rPr>
+                <w:rFonts w:ascii="Times New Roman" w:hAnsi="Times New Roman"/>
+                <w:i w:val="false"/>
+                <w:iCs w:val="false"/>
                 <w:sz w:val="24"/>
                 <w:szCs w:val="24"/>
                 <w:u w:val="single"/>
@@ -422,64 +462,20 @@
             <w:r>
               <w:rPr>
                 <w:rFonts w:ascii="Times New Roman" w:hAnsi="Times New Roman"/>
+                <w:i w:val="false"/>
+                <w:iCs w:val="false"/>
                 <w:sz w:val="24"/>
                 <w:szCs w:val="24"/>
                 <w:u w:val="single"/>
                 <w:lang w:val="ru-RU"/>
               </w:rPr>
-              <w:t>номер_нижний</w:t>
-            </w:r>
-            <w:r>
-              <w:rPr>
-                <w:rFonts w:ascii="Times New Roman" w:hAnsi="Times New Roman"/>
-                <w:sz w:val="24"/>
-                <w:szCs w:val="24"/>
-                <w:u w:val="single"/>
-                <w:lang w:val="en-US"/>
-              </w:rPr>
-              <w:t>}}</w:t>
-            </w:r>
-            <w:r>
-              <w:rPr>
-                <w:rFonts w:ascii="Times New Roman" w:hAnsi="Times New Roman"/>
-                <w:sz w:val="24"/>
-                <w:szCs w:val="24"/>
-                <w:lang w:val="en-US"/>
-              </w:rPr>
-              <w:t xml:space="preserve"> </w:t>
-            </w:r>
-            <w:r>
-              <w:rPr>
-                <w:rFonts w:ascii="Times New Roman" w:hAnsi="Times New Roman"/>
-                <w:sz w:val="24"/>
-                <w:szCs w:val="24"/>
-                <w:lang w:val="ru-RU"/>
-              </w:rPr>
-              <w:t xml:space="preserve">от </w:t>
-            </w:r>
-            <w:r>
-              <w:rPr>
-                <w:rFonts w:ascii="Times New Roman" w:hAnsi="Times New Roman"/>
-                <w:sz w:val="24"/>
-                <w:szCs w:val="24"/>
-                <w:u w:val="single"/>
-                <w:lang w:val="en-US"/>
-              </w:rPr>
-              <w:t>{{</w:t>
-            </w:r>
-            <w:r>
-              <w:rPr>
-                <w:rFonts w:ascii="Times New Roman" w:hAnsi="Times New Roman"/>
-                <w:sz w:val="24"/>
-                <w:szCs w:val="24"/>
-                <w:u w:val="single"/>
-                <w:lang w:val="ru-RU"/>
-              </w:rPr>
               <w:t>дата_номера</w:t>
             </w:r>
             <w:r>
               <w:rPr>
                 <w:rFonts w:ascii="Times New Roman" w:hAnsi="Times New Roman"/>
+                <w:i w:val="false"/>
+                <w:iCs w:val="false"/>
                 <w:sz w:val="24"/>
                 <w:szCs w:val="24"/>
                 <w:u w:val="single"/>
@@ -491,7 +487,7 @@
         </w:tc>
         <w:tc>
           <w:tcPr>
-            <w:tcW w:w="2545" w:type="dxa"/>
+            <w:tcW w:w="2550" w:type="dxa"/>
             <w:tcBorders>
               <w:top w:val="single" w:sz="4" w:space="0" w:color="000000"/>
               <w:start w:val="single" w:sz="4" w:space="0" w:color="000000"/>
@@ -500,7 +496,7 @@
           </w:tcPr>
           <w:p>
             <w:pPr>
-              <w:pStyle w:val="Style16"/>
+              <w:pStyle w:val="user2"/>
               <w:bidi w:val="0"/>
               <w:spacing w:lineRule="auto" w:line="240"/>
               <w:jc w:val="start"/>
@@ -531,7 +527,7 @@
           </w:tcPr>
           <w:p>
             <w:pPr>
-              <w:pStyle w:val="Style16"/>
+              <w:pStyle w:val="user2"/>
               <w:bidi w:val="0"/>
               <w:spacing w:lineRule="auto" w:line="240"/>
               <w:jc w:val="start"/>
@@ -551,7 +547,7 @@
           </w:p>
           <w:p>
             <w:pPr>
-              <w:pStyle w:val="Style16"/>
+              <w:pStyle w:val="user2"/>
               <w:bidi w:val="0"/>
               <w:spacing w:lineRule="auto" w:line="240"/>
               <w:jc w:val="start"/>
@@ -571,7 +567,7 @@
           </w:p>
           <w:p>
             <w:pPr>
-              <w:pStyle w:val="Style16"/>
+              <w:pStyle w:val="user2"/>
               <w:bidi w:val="0"/>
               <w:spacing w:lineRule="auto" w:line="240"/>
               <w:jc w:val="start"/>
@@ -591,7 +587,7 @@
           </w:p>
           <w:p>
             <w:pPr>
-              <w:pStyle w:val="Style16"/>
+              <w:pStyle w:val="user2"/>
               <w:bidi w:val="0"/>
               <w:spacing w:lineRule="auto" w:line="240"/>
               <w:jc w:val="start"/>
@@ -612,7 +608,7 @@
           </w:p>
           <w:p>
             <w:pPr>
-              <w:pStyle w:val="Style16"/>
+              <w:pStyle w:val="user2"/>
               <w:bidi w:val="0"/>
               <w:spacing w:lineRule="auto" w:line="240"/>
               <w:jc w:val="start"/>
@@ -632,7 +628,7 @@
           </w:p>
           <w:p>
             <w:pPr>
-              <w:pStyle w:val="Style16"/>
+              <w:pStyle w:val="user2"/>
               <w:bidi w:val="0"/>
               <w:spacing w:lineRule="auto" w:line="240"/>
               <w:jc w:val="start"/>
@@ -910,6 +906,7 @@
       <w:pgNumType w:fmt="decimal"/>
       <w:formProt w:val="false"/>
       <w:textDirection w:val="lrTb"/>
+      <w:docGrid w:type="default" w:linePitch="100" w:charSpace="0"/>
     </w:sectPr>
   </w:body>
 </w:document>
@@ -929,7 +926,6 @@
     </w:rPrDefault>
     <w:pPrDefault>
       <w:pPr>
-        <w:widowControl/>
         <w:suppressAutoHyphens w:val="true"/>
       </w:pPr>
     </w:pPrDefault>
@@ -939,7 +935,10 @@
     <w:qFormat/>
     <w:pPr>
       <w:widowControl/>
+      <w:suppressAutoHyphens w:val="true"/>
       <w:bidi w:val="0"/>
+      <w:spacing w:before="0" w:after="0"/>
+      <w:jc w:val="start"/>
     </w:pPr>
     <w:rPr>
       <w:rFonts w:ascii="Liberation Serif" w:hAnsi="Liberation Serif" w:eastAsia="NSimSun" w:cs="Lucida Sans"/>
@@ -1015,8 +1014,34 @@
       <w:rFonts w:cs="Lucida Sans"/>
     </w:rPr>
   </w:style>
-  <w:style w:type="paragraph" w:styleId="Style16">
-    <w:name w:val="Содержимое таблицы"/>
+  <w:style w:type="paragraph" w:styleId="user">
+    <w:name w:val="Заголовок (user)"/>
+    <w:basedOn w:val="Normal"/>
+    <w:next w:val="BodyText"/>
+    <w:qFormat/>
+    <w:pPr>
+      <w:keepNext w:val="true"/>
+      <w:spacing w:before="240" w:after="120"/>
+    </w:pPr>
+    <w:rPr>
+      <w:rFonts w:ascii="Liberation Sans" w:hAnsi="Liberation Sans" w:eastAsia="Microsoft YaHei" w:cs="Lucida Sans"/>
+      <w:sz w:val="28"/>
+      <w:szCs w:val="28"/>
+    </w:rPr>
+  </w:style>
+  <w:style w:type="paragraph" w:styleId="user1">
+    <w:name w:val="Указатель (user)"/>
+    <w:basedOn w:val="Normal"/>
+    <w:qFormat/>
+    <w:pPr>
+      <w:suppressLineNumbers/>
+    </w:pPr>
+    <w:rPr>
+      <w:rFonts w:cs="Lucida Sans"/>
+    </w:rPr>
+  </w:style>
+  <w:style w:type="paragraph" w:styleId="user2">
+    <w:name w:val="Содержимое таблицы (user)"/>
     <w:basedOn w:val="Normal"/>
     <w:qFormat/>
     <w:pPr>

</xml_diff>

<commit_message>
Replacing bookmarks done. Create constants.h
</commit_message>
<xml_diff>
--- a/templates/flat_card.docx
+++ b/templates/flat_card.docx
@@ -4,7 +4,7 @@
   <w:body>
     <w:tbl>
       <w:tblPr>
-        <w:tblW w:w="5000" w:type="pct"/>
+        <w:tblW w:w="9643" w:type="dxa"/>
         <w:jc w:val="start"/>
         <w:tblInd w:w="-5" w:type="dxa"/>
         <w:tblLayout w:type="fixed"/>
@@ -16,15 +16,15 @@
         </w:tblCellMar>
       </w:tblPr>
       <w:tblGrid>
-        <w:gridCol w:w="4075"/>
-        <w:gridCol w:w="2550"/>
-        <w:gridCol w:w="3013"/>
+        <w:gridCol w:w="4479"/>
+        <w:gridCol w:w="1864"/>
+        <w:gridCol w:w="3300"/>
       </w:tblGrid>
       <w:tr>
         <w:trPr/>
         <w:tc>
           <w:tcPr>
-            <w:tcW w:w="4075" w:type="dxa"/>
+            <w:tcW w:w="4479" w:type="dxa"/>
             <w:tcBorders>
               <w:top w:val="single" w:sz="4" w:space="0" w:color="000000"/>
               <w:start w:val="single" w:sz="4" w:space="0" w:color="000000"/>
@@ -33,7 +33,7 @@
           </w:tcPr>
           <w:p>
             <w:pPr>
-              <w:pStyle w:val="user2"/>
+              <w:pStyle w:val="Style16"/>
               <w:bidi w:val="0"/>
               <w:spacing w:lineRule="auto" w:line="240"/>
               <w:jc w:val="center"/>
@@ -102,7 +102,7 @@
           </w:p>
           <w:p>
             <w:pPr>
-              <w:pStyle w:val="user2"/>
+              <w:pStyle w:val="Style16"/>
               <w:bidi w:val="0"/>
               <w:spacing w:lineRule="auto" w:line="240"/>
               <w:jc w:val="center"/>
@@ -135,7 +135,7 @@
           </w:p>
           <w:p>
             <w:pPr>
-              <w:pStyle w:val="user2"/>
+              <w:pStyle w:val="Style16"/>
               <w:bidi w:val="0"/>
               <w:spacing w:lineRule="auto" w:line="240"/>
               <w:jc w:val="center"/>
@@ -156,7 +156,7 @@
           </w:p>
           <w:p>
             <w:pPr>
-              <w:pStyle w:val="user2"/>
+              <w:pStyle w:val="Style16"/>
               <w:bidi w:val="0"/>
               <w:spacing w:lineRule="auto" w:line="240"/>
               <w:jc w:val="center"/>
@@ -177,7 +177,7 @@
           </w:p>
           <w:p>
             <w:pPr>
-              <w:pStyle w:val="user2"/>
+              <w:pStyle w:val="Style16"/>
               <w:bidi w:val="0"/>
               <w:spacing w:lineRule="auto" w:line="240"/>
               <w:jc w:val="center"/>
@@ -198,7 +198,7 @@
           </w:p>
           <w:p>
             <w:pPr>
-              <w:pStyle w:val="user2"/>
+              <w:pStyle w:val="Style16"/>
               <w:bidi w:val="0"/>
               <w:spacing w:lineRule="auto" w:line="240"/>
               <w:jc w:val="center"/>
@@ -219,7 +219,7 @@
           </w:p>
           <w:p>
             <w:pPr>
-              <w:pStyle w:val="user2"/>
+              <w:pStyle w:val="Style16"/>
               <w:bidi w:val="0"/>
               <w:spacing w:lineRule="auto" w:line="240"/>
               <w:jc w:val="center"/>
@@ -251,7 +251,7 @@
           </w:p>
           <w:p>
             <w:pPr>
-              <w:pStyle w:val="user2"/>
+              <w:pStyle w:val="Style16"/>
               <w:bidi w:val="0"/>
               <w:spacing w:lineRule="auto" w:line="240"/>
               <w:jc w:val="center"/>
@@ -274,7 +274,7 @@
           </w:p>
           <w:p>
             <w:pPr>
-              <w:pStyle w:val="user2"/>
+              <w:pStyle w:val="Style16"/>
               <w:bidi w:val="0"/>
               <w:spacing w:lineRule="auto" w:line="240"/>
               <w:jc w:val="center"/>
@@ -297,7 +297,7 @@
           </w:p>
           <w:p>
             <w:pPr>
-              <w:pStyle w:val="user2"/>
+              <w:pStyle w:val="Style16"/>
               <w:bidi w:val="0"/>
               <w:spacing w:lineRule="auto" w:line="240"/>
               <w:jc w:val="center"/>
@@ -319,16 +319,7 @@
                 <w:u w:val="single"/>
                 <w:lang w:eastAsia="zh-CN" w:bidi="hi-IN"/>
               </w:rPr>
-              <w:t>{{дата}}</w:t>
-            </w:r>
-            <w:r>
-              <w:rPr>
-                <w:rFonts w:ascii="Times New Roman" w:hAnsi="Times New Roman"/>
-                <w:sz w:val="20"/>
-                <w:szCs w:val="20"/>
-                <w:lang w:val="en-US"/>
-              </w:rPr>
-              <w:t xml:space="preserve"> </w:t>
+              <w:t xml:space="preserve">{{дата}} </w:t>
             </w:r>
             <w:r>
               <w:rPr>
@@ -337,7 +328,7 @@
                 <w:szCs w:val="24"/>
                 <w:lang w:val="ru-RU"/>
               </w:rPr>
-              <w:t xml:space="preserve">№ </w:t>
+              <w:t>№</w:t>
             </w:r>
             <w:r>
               <w:rPr>
@@ -372,7 +363,7 @@
           </w:p>
           <w:p>
             <w:pPr>
-              <w:pStyle w:val="user2"/>
+              <w:pStyle w:val="Style16"/>
               <w:bidi w:val="0"/>
               <w:spacing w:lineRule="auto" w:line="240"/>
               <w:jc w:val="center"/>
@@ -393,59 +384,49 @@
                 <w:szCs w:val="24"/>
                 <w:lang w:val="ru-RU"/>
               </w:rPr>
-              <w:t>№</w:t>
-            </w:r>
-            <w:r>
-              <w:rPr>
-                <w:rFonts w:ascii="Times New Roman" w:hAnsi="Times New Roman"/>
+              <w:t>На №</w:t>
+            </w:r>
+            <w:r>
+              <w:rPr>
+                <w:rFonts w:ascii="Times New Roman" w:hAnsi="Times New Roman"/>
+                <w:sz w:val="24"/>
+                <w:szCs w:val="24"/>
+                <w:u w:val="single"/>
+                <w:lang w:val="en-US"/>
+              </w:rPr>
+              <w:t>{{</w:t>
+            </w:r>
+            <w:r>
+              <w:rPr>
+                <w:rFonts w:ascii="Times New Roman" w:hAnsi="Times New Roman"/>
+                <w:sz w:val="24"/>
+                <w:szCs w:val="24"/>
+                <w:u w:val="single"/>
+                <w:lang w:val="ru-RU"/>
+              </w:rPr>
+              <w:t>номер_нижний</w:t>
+            </w:r>
+            <w:r>
+              <w:rPr>
+                <w:rFonts w:ascii="Times New Roman" w:hAnsi="Times New Roman"/>
+                <w:sz w:val="24"/>
+                <w:szCs w:val="24"/>
+                <w:u w:val="single"/>
+                <w:lang w:val="en-US"/>
+              </w:rPr>
+              <w:t xml:space="preserve">}} </w:t>
+            </w:r>
+            <w:r>
+              <w:rPr>
+                <w:rFonts w:ascii="Times New Roman" w:hAnsi="Times New Roman"/>
+                <w:i w:val="false"/>
+                <w:iCs w:val="false"/>
                 <w:sz w:val="24"/>
                 <w:szCs w:val="24"/>
                 <w:u w:val="none"/>
                 <w:lang w:val="ru-RU"/>
               </w:rPr>
-              <w:t xml:space="preserve"> </w:t>
-            </w:r>
-            <w:r>
-              <w:rPr>
-                <w:rFonts w:ascii="Times New Roman" w:hAnsi="Times New Roman"/>
-                <w:sz w:val="24"/>
-                <w:szCs w:val="24"/>
-                <w:u w:val="single"/>
-                <w:lang w:val="en-US"/>
-              </w:rPr>
-              <w:t>{{</w:t>
-            </w:r>
-            <w:r>
-              <w:rPr>
-                <w:rFonts w:ascii="Times New Roman" w:hAnsi="Times New Roman"/>
-                <w:sz w:val="24"/>
-                <w:szCs w:val="24"/>
-                <w:u w:val="single"/>
-                <w:lang w:val="ru-RU"/>
-              </w:rPr>
-              <w:t>номер_нижний</w:t>
-            </w:r>
-            <w:r>
-              <w:rPr>
-                <w:rFonts w:ascii="Times New Roman" w:hAnsi="Times New Roman"/>
-                <w:sz w:val="24"/>
-                <w:szCs w:val="24"/>
-                <w:u w:val="single"/>
-                <w:lang w:val="en-US"/>
-              </w:rPr>
-              <w:t>}}</w:t>
-            </w:r>
-            <w:r>
-              <w:rPr>
-                <w:rFonts w:ascii="Times New Roman" w:hAnsi="Times New Roman"/>
-                <w:i w:val="false"/>
-                <w:iCs w:val="false"/>
-                <w:sz w:val="24"/>
-                <w:szCs w:val="24"/>
-                <w:u w:val="none"/>
-                <w:lang w:val="ru-RU"/>
-              </w:rPr>
-              <w:t xml:space="preserve"> от </w:t>
+              <w:t xml:space="preserve">от </w:t>
             </w:r>
             <w:r>
               <w:rPr>
@@ -487,7 +468,7 @@
         </w:tc>
         <w:tc>
           <w:tcPr>
-            <w:tcW w:w="2550" w:type="dxa"/>
+            <w:tcW w:w="1864" w:type="dxa"/>
             <w:tcBorders>
               <w:top w:val="single" w:sz="4" w:space="0" w:color="000000"/>
               <w:start w:val="single" w:sz="4" w:space="0" w:color="000000"/>
@@ -496,7 +477,7 @@
           </w:tcPr>
           <w:p>
             <w:pPr>
-              <w:pStyle w:val="user2"/>
+              <w:pStyle w:val="Style16"/>
               <w:bidi w:val="0"/>
               <w:spacing w:lineRule="auto" w:line="240"/>
               <w:jc w:val="start"/>
@@ -517,7 +498,7 @@
         </w:tc>
         <w:tc>
           <w:tcPr>
-            <w:tcW w:w="3013" w:type="dxa"/>
+            <w:tcW w:w="3300" w:type="dxa"/>
             <w:tcBorders>
               <w:top w:val="single" w:sz="4" w:space="0" w:color="000000"/>
               <w:start w:val="single" w:sz="4" w:space="0" w:color="000000"/>
@@ -527,7 +508,7 @@
           </w:tcPr>
           <w:p>
             <w:pPr>
-              <w:pStyle w:val="user2"/>
+              <w:pStyle w:val="Style16"/>
               <w:bidi w:val="0"/>
               <w:spacing w:lineRule="auto" w:line="240"/>
               <w:jc w:val="start"/>
@@ -547,7 +528,7 @@
           </w:p>
           <w:p>
             <w:pPr>
-              <w:pStyle w:val="user2"/>
+              <w:pStyle w:val="Style16"/>
               <w:bidi w:val="0"/>
               <w:spacing w:lineRule="auto" w:line="240"/>
               <w:jc w:val="start"/>
@@ -567,7 +548,7 @@
           </w:p>
           <w:p>
             <w:pPr>
-              <w:pStyle w:val="user2"/>
+              <w:pStyle w:val="Style16"/>
               <w:bidi w:val="0"/>
               <w:spacing w:lineRule="auto" w:line="240"/>
               <w:jc w:val="start"/>
@@ -587,7 +568,7 @@
           </w:p>
           <w:p>
             <w:pPr>
-              <w:pStyle w:val="user2"/>
+              <w:pStyle w:val="Style16"/>
               <w:bidi w:val="0"/>
               <w:spacing w:lineRule="auto" w:line="240"/>
               <w:jc w:val="start"/>
@@ -603,12 +584,14 @@
                 <w:strike w:val="false"/>
                 <w:dstrike w:val="false"/>
               </w:rPr>
-              <w:t>Заместителю начальника ОМВД России по г. Артему — начальнику ОВМ подполковнику полиции С.Н. Мастерко</w:t>
-            </w:r>
-          </w:p>
-          <w:p>
-            <w:pPr>
-              <w:pStyle w:val="user2"/>
+              <w:t xml:space="preserve">Заместителю начальника ОМВД России по г. Артему — начальнику ОВМ подполковнику полиции </w:t>
+              <w:br/>
+              <w:t>С.Н. Мастерко</w:t>
+            </w:r>
+          </w:p>
+          <w:p>
+            <w:pPr>
+              <w:pStyle w:val="Style16"/>
               <w:bidi w:val="0"/>
               <w:spacing w:lineRule="auto" w:line="240"/>
               <w:jc w:val="start"/>
@@ -628,7 +611,7 @@
           </w:p>
           <w:p>
             <w:pPr>
-              <w:pStyle w:val="user2"/>
+              <w:pStyle w:val="Style16"/>
               <w:bidi w:val="0"/>
               <w:spacing w:lineRule="auto" w:line="240"/>
               <w:jc w:val="start"/>
@@ -1040,8 +1023,8 @@
       <w:rFonts w:cs="Lucida Sans"/>
     </w:rPr>
   </w:style>
-  <w:style w:type="paragraph" w:styleId="user2">
-    <w:name w:val="Содержимое таблицы (user)"/>
+  <w:style w:type="paragraph" w:styleId="Style16">
+    <w:name w:val="Содержимое таблицы"/>
     <w:basedOn w:val="Normal"/>
     <w:qFormat/>
     <w:pPr>

</xml_diff>

<commit_message>
Attemt to read bookmarks from document
</commit_message>
<xml_diff>
--- a/templates/flat_card.docx
+++ b/templates/flat_card.docx
@@ -317,9 +317,21 @@
                 <w:sz w:val="24"/>
                 <w:szCs w:val="24"/>
                 <w:u w:val="single"/>
-                <w:lang w:eastAsia="zh-CN" w:bidi="hi-IN"/>
-              </w:rPr>
-              <w:t xml:space="preserve">{{дата}} </w:t>
+                <w:lang w:val="ru-RU" w:eastAsia="zh-CN" w:bidi="hi-IN"/>
+              </w:rPr>
+              <w:t>{{дата}}</w:t>
+            </w:r>
+            <w:r>
+              <w:rPr>
+                <w:rFonts w:eastAsia="NSimSun" w:cs="Lucida Sans" w:ascii="Times New Roman" w:hAnsi="Times New Roman"/>
+                <w:color w:val="auto"/>
+                <w:kern w:val="2"/>
+                <w:sz w:val="24"/>
+                <w:szCs w:val="24"/>
+                <w:u w:val="none"/>
+                <w:lang w:val="ru-RU" w:eastAsia="zh-CN" w:bidi="hi-IN"/>
+              </w:rPr>
+              <w:t xml:space="preserve"> </w:t>
             </w:r>
             <w:r>
               <w:rPr>
@@ -414,7 +426,17 @@
                 <w:u w:val="single"/>
                 <w:lang w:val="en-US"/>
               </w:rPr>
-              <w:t xml:space="preserve">}} </w:t>
+              <w:t>}}</w:t>
+            </w:r>
+            <w:r>
+              <w:rPr>
+                <w:rFonts w:ascii="Times New Roman" w:hAnsi="Times New Roman"/>
+                <w:sz w:val="24"/>
+                <w:szCs w:val="24"/>
+                <w:u w:val="none"/>
+                <w:lang w:val="en-US"/>
+              </w:rPr>
+              <w:t xml:space="preserve"> </w:t>
             </w:r>
             <w:r>
               <w:rPr>

</xml_diff>

<commit_message>
Abilty to load document and replace bookmarks. Show bookmarks in the UI
</commit_message>
<xml_diff>
--- a/templates/flat_card.docx
+++ b/templates/flat_card.docx
@@ -128,7 +128,6 @@
                 <w:sz w:val="24"/>
                 <w:szCs w:val="24"/>
               </w:rPr>
-              <w:t xml:space="preserve"> </w:t>
               <w:br/>
               <w:t xml:space="preserve">«Приморский центр социального обслуживания населения» </w:t>
             </w:r>
@@ -348,95 +347,67 @@
                 <w:sz w:val="24"/>
                 <w:szCs w:val="24"/>
                 <w:u w:val="single"/>
-                <w:lang w:val="en-US"/>
-              </w:rPr>
-              <w:t>{{</w:t>
-            </w:r>
-            <w:r>
-              <w:rPr>
-                <w:rFonts w:ascii="Times New Roman" w:hAnsi="Times New Roman"/>
-                <w:sz w:val="24"/>
-                <w:szCs w:val="24"/>
-                <w:u w:val="single"/>
-                <w:lang w:val="ru-RU"/>
-              </w:rPr>
-              <w:t>номер_верхний</w:t>
-            </w:r>
-            <w:r>
-              <w:rPr>
-                <w:rFonts w:ascii="Times New Roman" w:hAnsi="Times New Roman"/>
+                <w:lang w:val="ru-RU"/>
+              </w:rPr>
+              <w:t>{{номер_верхний}}</w:t>
+            </w:r>
+          </w:p>
+          <w:p>
+            <w:pPr>
+              <w:pStyle w:val="Style16"/>
+              <w:bidi w:val="0"/>
+              <w:spacing w:lineRule="auto" w:line="240"/>
+              <w:jc w:val="center"/>
+              <w:rPr>
+                <w:rFonts w:ascii="Times New Roman" w:hAnsi="Times New Roman"/>
+                <w:i w:val="false"/>
+                <w:iCs w:val="false"/>
                 <w:sz w:val="24"/>
                 <w:szCs w:val="24"/>
                 <w:u w:val="single"/>
                 <w:lang w:val="en-US"/>
               </w:rPr>
-              <w:t>}}</w:t>
-            </w:r>
-          </w:p>
-          <w:p>
-            <w:pPr>
-              <w:pStyle w:val="Style16"/>
-              <w:bidi w:val="0"/>
-              <w:spacing w:lineRule="auto" w:line="240"/>
-              <w:jc w:val="center"/>
+            </w:pPr>
+            <w:r>
+              <w:rPr>
+                <w:rFonts w:ascii="Times New Roman" w:hAnsi="Times New Roman"/>
+                <w:sz w:val="24"/>
+                <w:szCs w:val="24"/>
+                <w:lang w:val="ru-RU"/>
+              </w:rPr>
+              <w:t>На №</w:t>
+            </w:r>
+            <w:r>
+              <w:rPr>
+                <w:rFonts w:ascii="Times New Roman" w:hAnsi="Times New Roman"/>
+                <w:sz w:val="24"/>
+                <w:szCs w:val="24"/>
+                <w:u w:val="single"/>
+                <w:lang w:val="ru-RU"/>
+              </w:rPr>
+              <w:t>{{номер_нижний}}</w:t>
+            </w:r>
+            <w:r>
+              <w:rPr>
+                <w:rFonts w:ascii="Times New Roman" w:hAnsi="Times New Roman"/>
+                <w:sz w:val="24"/>
+                <w:szCs w:val="24"/>
+                <w:u w:val="none"/>
+                <w:lang w:val="ru-RU"/>
+              </w:rPr>
+              <w:t xml:space="preserve"> </w:t>
+            </w:r>
+            <w:r>
               <w:rPr>
                 <w:rFonts w:ascii="Times New Roman" w:hAnsi="Times New Roman"/>
                 <w:i w:val="false"/>
                 <w:iCs w:val="false"/>
                 <w:sz w:val="24"/>
                 <w:szCs w:val="24"/>
-                <w:u w:val="single"/>
-                <w:lang w:val="en-US"/>
-              </w:rPr>
-            </w:pPr>
-            <w:r>
-              <w:rPr>
-                <w:rFonts w:ascii="Times New Roman" w:hAnsi="Times New Roman"/>
-                <w:sz w:val="24"/>
-                <w:szCs w:val="24"/>
-                <w:lang w:val="ru-RU"/>
-              </w:rPr>
-              <w:t>На №</w:t>
-            </w:r>
-            <w:r>
-              <w:rPr>
-                <w:rFonts w:ascii="Times New Roman" w:hAnsi="Times New Roman"/>
-                <w:sz w:val="24"/>
-                <w:szCs w:val="24"/>
-                <w:u w:val="single"/>
-                <w:lang w:val="en-US"/>
-              </w:rPr>
-              <w:t>{{</w:t>
-            </w:r>
-            <w:r>
-              <w:rPr>
-                <w:rFonts w:ascii="Times New Roman" w:hAnsi="Times New Roman"/>
-                <w:sz w:val="24"/>
-                <w:szCs w:val="24"/>
-                <w:u w:val="single"/>
-                <w:lang w:val="ru-RU"/>
-              </w:rPr>
-              <w:t>номер_нижний</w:t>
-            </w:r>
-            <w:r>
-              <w:rPr>
-                <w:rFonts w:ascii="Times New Roman" w:hAnsi="Times New Roman"/>
-                <w:sz w:val="24"/>
-                <w:szCs w:val="24"/>
-                <w:u w:val="single"/>
-                <w:lang w:val="en-US"/>
-              </w:rPr>
-              <w:t>}}</w:t>
-            </w:r>
-            <w:r>
-              <w:rPr>
-                <w:rFonts w:ascii="Times New Roman" w:hAnsi="Times New Roman"/>
-                <w:sz w:val="24"/>
-                <w:szCs w:val="24"/>
                 <w:u w:val="none"/>
-                <w:lang w:val="en-US"/>
-              </w:rPr>
-              <w:t xml:space="preserve"> </w:t>
+                <w:lang w:val="ru-RU"/>
+              </w:rPr>
+              <w:t xml:space="preserve">от </w:t>
             </w:r>
             <w:r>
               <w:rPr>
@@ -445,46 +416,10 @@
                 <w:iCs w:val="false"/>
                 <w:sz w:val="24"/>
                 <w:szCs w:val="24"/>
-                <w:u w:val="none"/>
-                <w:lang w:val="ru-RU"/>
-              </w:rPr>
-              <w:t xml:space="preserve">от </w:t>
-            </w:r>
-            <w:r>
-              <w:rPr>
-                <w:rFonts w:ascii="Times New Roman" w:hAnsi="Times New Roman"/>
-                <w:i w:val="false"/>
-                <w:iCs w:val="false"/>
-                <w:sz w:val="24"/>
-                <w:szCs w:val="24"/>
                 <w:u w:val="single"/>
-                <w:lang w:val="en-US"/>
-              </w:rPr>
-              <w:t>{{</w:t>
-            </w:r>
-            <w:r>
-              <w:rPr>
-                <w:rFonts w:ascii="Times New Roman" w:hAnsi="Times New Roman"/>
-                <w:i w:val="false"/>
-                <w:iCs w:val="false"/>
-                <w:sz w:val="24"/>
-                <w:szCs w:val="24"/>
-                <w:u w:val="single"/>
-                <w:lang w:val="ru-RU"/>
-              </w:rPr>
-              <w:t>дата_номера</w:t>
-            </w:r>
-            <w:r>
-              <w:rPr>
-                <w:rFonts w:ascii="Times New Roman" w:hAnsi="Times New Roman"/>
-                <w:i w:val="false"/>
-                <w:iCs w:val="false"/>
-                <w:sz w:val="24"/>
-                <w:szCs w:val="24"/>
-                <w:u w:val="single"/>
-                <w:lang w:val="en-US"/>
-              </w:rPr>
-              <w:t>}}</w:t>
+                <w:lang w:val="ru-RU"/>
+              </w:rPr>
+              <w:t>{{дата_номера}}</w:t>
             </w:r>
           </w:p>
         </w:tc>
@@ -791,9 +726,27 @@
           <w:i w:val="false"/>
           <w:iCs w:val="false"/>
           <w:u w:val="single"/>
+          <w:lang w:val="ru-RU"/>
+        </w:rPr>
+        <w:t>{{фио}}</w:t>
+      </w:r>
+      <w:r>
+        <w:rPr>
+          <w:i w:val="false"/>
+          <w:iCs w:val="false"/>
+          <w:u w:val="none"/>
           <w:lang w:val="en-US"/>
         </w:rPr>
-        <w:t>{{</w:t>
+        <w:t xml:space="preserve">, </w:t>
+      </w:r>
+      <w:r>
+        <w:rPr>
+          <w:i w:val="false"/>
+          <w:iCs w:val="false"/>
+          <w:u w:val="none"/>
+          <w:lang w:val="ru-RU"/>
+        </w:rPr>
+        <w:t xml:space="preserve">дата рождения: </w:t>
       </w:r>
       <w:r>
         <w:rPr>
@@ -802,16 +755,7 @@
           <w:u w:val="single"/>
           <w:lang w:val="ru-RU"/>
         </w:rPr>
-        <w:t>фио</w:t>
-      </w:r>
-      <w:r>
-        <w:rPr>
-          <w:i w:val="false"/>
-          <w:iCs w:val="false"/>
-          <w:u w:val="single"/>
-          <w:lang w:val="en-US"/>
-        </w:rPr>
-        <w:t>}}</w:t>
+        <w:t>{{дата_рождения}}</w:t>
       </w:r>
       <w:r>
         <w:rPr>
@@ -829,16 +773,7 @@
           <w:u w:val="none"/>
           <w:lang w:val="ru-RU"/>
         </w:rPr>
-        <w:t xml:space="preserve">дата рождения: </w:t>
-      </w:r>
-      <w:r>
-        <w:rPr>
-          <w:i w:val="false"/>
-          <w:iCs w:val="false"/>
-          <w:u w:val="single"/>
-          <w:lang w:val="en-US"/>
-        </w:rPr>
-        <w:t>{{</w:t>
+        <w:t xml:space="preserve">адрес: </w:t>
       </w:r>
       <w:r>
         <w:rPr>
@@ -847,61 +782,7 @@
           <w:u w:val="single"/>
           <w:lang w:val="ru-RU"/>
         </w:rPr>
-        <w:t>дата_рождения</w:t>
-      </w:r>
-      <w:r>
-        <w:rPr>
-          <w:i w:val="false"/>
-          <w:iCs w:val="false"/>
-          <w:u w:val="single"/>
-          <w:lang w:val="en-US"/>
-        </w:rPr>
-        <w:t>}}</w:t>
-      </w:r>
-      <w:r>
-        <w:rPr>
-          <w:i w:val="false"/>
-          <w:iCs w:val="false"/>
-          <w:u w:val="none"/>
-          <w:lang w:val="en-US"/>
-        </w:rPr>
-        <w:t xml:space="preserve">, </w:t>
-      </w:r>
-      <w:r>
-        <w:rPr>
-          <w:i w:val="false"/>
-          <w:iCs w:val="false"/>
-          <w:u w:val="none"/>
-          <w:lang w:val="ru-RU"/>
-        </w:rPr>
-        <w:t xml:space="preserve">адрес: </w:t>
-      </w:r>
-      <w:r>
-        <w:rPr>
-          <w:i w:val="false"/>
-          <w:iCs w:val="false"/>
-          <w:u w:val="single"/>
-          <w:lang w:val="en-US"/>
-        </w:rPr>
-        <w:t>{{</w:t>
-      </w:r>
-      <w:r>
-        <w:rPr>
-          <w:i w:val="false"/>
-          <w:iCs w:val="false"/>
-          <w:u w:val="single"/>
-          <w:lang w:val="ru-RU"/>
-        </w:rPr>
-        <w:t>адрес</w:t>
-      </w:r>
-      <w:r>
-        <w:rPr>
-          <w:i w:val="false"/>
-          <w:iCs w:val="false"/>
-          <w:u w:val="single"/>
-          <w:lang w:val="en-US"/>
-        </w:rPr>
-        <w:t>}}</w:t>
+        <w:t>{{адрес}}</w:t>
       </w:r>
     </w:p>
     <w:sectPr>

</xml_diff>

<commit_message>
Fix russian filename won't save. Align ui edits and labels
</commit_message>
<xml_diff>
--- a/templates/flat_card.docx
+++ b/templates/flat_card.docx
@@ -33,7 +33,7 @@
           </w:tcPr>
           <w:p>
             <w:pPr>
-              <w:pStyle w:val="user2"/>
+              <w:pStyle w:val="Style16"/>
               <w:bidi w:val="0"/>
               <w:spacing w:lineRule="auto" w:line="240"/>
               <w:jc w:val="center"/>
@@ -102,7 +102,7 @@
           </w:p>
           <w:p>
             <w:pPr>
-              <w:pStyle w:val="user2"/>
+              <w:pStyle w:val="Style16"/>
               <w:bidi w:val="0"/>
               <w:spacing w:lineRule="auto" w:line="240"/>
               <w:jc w:val="center"/>
@@ -134,7 +134,7 @@
           </w:p>
           <w:p>
             <w:pPr>
-              <w:pStyle w:val="user2"/>
+              <w:pStyle w:val="Style16"/>
               <w:bidi w:val="0"/>
               <w:spacing w:lineRule="auto" w:line="240"/>
               <w:jc w:val="center"/>
@@ -155,7 +155,7 @@
           </w:p>
           <w:p>
             <w:pPr>
-              <w:pStyle w:val="user2"/>
+              <w:pStyle w:val="Style16"/>
               <w:bidi w:val="0"/>
               <w:spacing w:lineRule="auto" w:line="240"/>
               <w:jc w:val="center"/>
@@ -176,7 +176,7 @@
           </w:p>
           <w:p>
             <w:pPr>
-              <w:pStyle w:val="user2"/>
+              <w:pStyle w:val="Style16"/>
               <w:bidi w:val="0"/>
               <w:spacing w:lineRule="auto" w:line="240"/>
               <w:jc w:val="center"/>
@@ -197,7 +197,7 @@
           </w:p>
           <w:p>
             <w:pPr>
-              <w:pStyle w:val="user2"/>
+              <w:pStyle w:val="Style16"/>
               <w:bidi w:val="0"/>
               <w:spacing w:lineRule="auto" w:line="240"/>
               <w:jc w:val="center"/>
@@ -218,7 +218,7 @@
           </w:p>
           <w:p>
             <w:pPr>
-              <w:pStyle w:val="user2"/>
+              <w:pStyle w:val="Style16"/>
               <w:bidi w:val="0"/>
               <w:spacing w:lineRule="auto" w:line="240"/>
               <w:jc w:val="center"/>
@@ -250,7 +250,7 @@
           </w:p>
           <w:p>
             <w:pPr>
-              <w:pStyle w:val="user2"/>
+              <w:pStyle w:val="Style16"/>
               <w:bidi w:val="0"/>
               <w:spacing w:lineRule="auto" w:line="240"/>
               <w:jc w:val="center"/>
@@ -273,7 +273,7 @@
           </w:p>
           <w:p>
             <w:pPr>
-              <w:pStyle w:val="user2"/>
+              <w:pStyle w:val="Style16"/>
               <w:bidi w:val="0"/>
               <w:spacing w:lineRule="auto" w:line="240"/>
               <w:jc w:val="center"/>
@@ -296,7 +296,7 @@
           </w:p>
           <w:p>
             <w:pPr>
-              <w:pStyle w:val="user2"/>
+              <w:pStyle w:val="Style16"/>
               <w:bidi w:val="0"/>
               <w:spacing w:lineRule="auto" w:line="240"/>
               <w:jc w:val="center"/>
@@ -330,7 +330,7 @@
                 <w:u w:val="none"/>
                 <w:lang w:val="ru-RU" w:eastAsia="zh-CN" w:bidi="hi-IN"/>
               </w:rPr>
-              <w:t xml:space="preserve"> </w:t>
+              <w:t> </w:t>
             </w:r>
             <w:r>
               <w:rPr>
@@ -354,7 +354,7 @@
           </w:p>
           <w:p>
             <w:pPr>
-              <w:pStyle w:val="user2"/>
+              <w:pStyle w:val="Style16"/>
               <w:bidi w:val="0"/>
               <w:spacing w:lineRule="auto" w:line="240"/>
               <w:jc w:val="center"/>
@@ -424,7 +424,7 @@
           </w:tcPr>
           <w:p>
             <w:pPr>
-              <w:pStyle w:val="user2"/>
+              <w:pStyle w:val="Style16"/>
               <w:bidi w:val="0"/>
               <w:spacing w:lineRule="auto" w:line="240"/>
               <w:jc w:val="start"/>
@@ -455,7 +455,7 @@
           </w:tcPr>
           <w:p>
             <w:pPr>
-              <w:pStyle w:val="user2"/>
+              <w:pStyle w:val="Style16"/>
               <w:bidi w:val="0"/>
               <w:spacing w:lineRule="auto" w:line="240"/>
               <w:jc w:val="start"/>
@@ -475,7 +475,7 @@
           </w:p>
           <w:p>
             <w:pPr>
-              <w:pStyle w:val="user2"/>
+              <w:pStyle w:val="Style16"/>
               <w:bidi w:val="0"/>
               <w:spacing w:lineRule="auto" w:line="240"/>
               <w:jc w:val="start"/>
@@ -495,7 +495,7 @@
           </w:p>
           <w:p>
             <w:pPr>
-              <w:pStyle w:val="user2"/>
+              <w:pStyle w:val="Style16"/>
               <w:bidi w:val="0"/>
               <w:spacing w:lineRule="auto" w:line="240"/>
               <w:jc w:val="start"/>
@@ -515,36 +515,27 @@
           </w:p>
           <w:p>
             <w:pPr>
-              <w:pStyle w:val="user2"/>
+              <w:pStyle w:val="Style16"/>
               <w:bidi w:val="0"/>
               <w:spacing w:lineRule="auto" w:line="240"/>
               <w:jc w:val="start"/>
               <w:rPr>
-                <w:lang w:val="en-US"/>
-              </w:rPr>
-            </w:pPr>
-            <w:r>
-              <w:rPr>
-                <w:lang w:val="en-US"/>
-              </w:rPr>
-              <w:t>{{</w:t>
-            </w:r>
-            <w:r>
-              <w:rPr>
-                <w:lang w:val="ru-RU"/>
-              </w:rPr>
-              <w:t>кому</w:t>
-            </w:r>
-            <w:r>
-              <w:rPr>
-                <w:lang w:val="en-US"/>
-              </w:rPr>
-              <w:t>}}</w:t>
-            </w:r>
-          </w:p>
-          <w:p>
-            <w:pPr>
-              <w:pStyle w:val="user2"/>
+                <w:rFonts w:ascii="Times New Roman" w:hAnsi="Times New Roman"/>
+                <w:strike w:val="false"/>
+                <w:dstrike w:val="false"/>
+              </w:rPr>
+            </w:pPr>
+            <w:r>
+              <w:rPr>
+                <w:rFonts w:ascii="Times New Roman" w:hAnsi="Times New Roman"/>
+                <w:strike w:val="false"/>
+                <w:dstrike w:val="false"/>
+              </w:rPr>
+            </w:r>
+          </w:p>
+          <w:p>
+            <w:pPr>
+              <w:pStyle w:val="Style16"/>
               <w:bidi w:val="0"/>
               <w:spacing w:lineRule="auto" w:line="240"/>
               <w:jc w:val="start"/>
@@ -554,13 +545,14 @@
             </w:pPr>
             <w:r>
               <w:rPr>
-                <w:lang w:val="en-US"/>
-              </w:rPr>
-            </w:r>
-          </w:p>
-          <w:p>
-            <w:pPr>
-              <w:pStyle w:val="user2"/>
+                <w:lang w:val="ru-RU"/>
+              </w:rPr>
+              <w:t>{{кому}}</w:t>
+            </w:r>
+          </w:p>
+          <w:p>
+            <w:pPr>
+              <w:pStyle w:val="Style16"/>
               <w:bidi w:val="0"/>
               <w:spacing w:lineRule="auto" w:line="240"/>
               <w:jc w:val="start"/>
@@ -572,19 +564,41 @@
               <w:rPr>
                 <w:lang w:val="en-US"/>
               </w:rPr>
-              <w:t>{{</w:t>
-            </w:r>
-            <w:r>
-              <w:rPr>
-                <w:lang w:val="en-US"/>
-              </w:rPr>
-              <w:t>к</w:t>
-            </w:r>
-            <w:r>
-              <w:rPr>
-                <w:lang w:val="ru-RU"/>
-              </w:rPr>
-              <w:t>ому:_адрес</w:t>
+            </w:r>
+          </w:p>
+          <w:p>
+            <w:pPr>
+              <w:pStyle w:val="Style16"/>
+              <w:bidi w:val="0"/>
+              <w:spacing w:lineRule="auto" w:line="240"/>
+              <w:jc w:val="start"/>
+              <w:rPr>
+                <w:lang w:val="en-US"/>
+              </w:rPr>
+            </w:pPr>
+            <w:r>
+              <w:rPr>
+                <w:lang w:val="en-US"/>
+              </w:rPr>
+              <w:t>{{к</w:t>
+            </w:r>
+            <w:r>
+              <w:rPr>
+                <w:lang w:val="ru-RU"/>
+              </w:rPr>
+              <w:t>ому:</w:t>
+            </w:r>
+            <w:r>
+              <w:rPr>
+                <w:lang w:val="en-US"/>
+              </w:rPr>
+              <w:t>_</w:t>
+            </w:r>
+            <w:r>
+              <w:rPr>
+                <w:lang w:val="ru-RU"/>
+              </w:rPr>
+              <w:t>адрес</w:t>
             </w:r>
             <w:r>
               <w:rPr>
@@ -658,21 +672,9 @@
       </w:r>
       <w:r>
         <w:rPr>
-          <w:lang w:val="en-US"/>
-        </w:rPr>
-        <w:t>{{</w:t>
-      </w:r>
-      <w:r>
-        <w:rPr>
           <w:lang w:val="ru-RU"/>
         </w:rPr>
-        <w:t>кому:_имя,_отчество</w:t>
-      </w:r>
-      <w:r>
-        <w:rPr>
-          <w:lang w:val="en-US"/>
-        </w:rPr>
-        <w:t>}}</w:t>
+        <w:t>{{кому:_имя,_отчество}}</w:t>
       </w:r>
       <w:r>
         <w:rPr/>
@@ -954,8 +956,8 @@
       <w:rFonts w:cs="Lucida Sans"/>
     </w:rPr>
   </w:style>
-  <w:style w:type="paragraph" w:styleId="user2">
-    <w:name w:val="Содержимое таблицы (user)"/>
+  <w:style w:type="paragraph" w:styleId="Style16">
+    <w:name w:val="Содержимое таблицы"/>
     <w:basedOn w:val="Normal"/>
     <w:qFormat/>
     <w:pPr>

</xml_diff>

<commit_message>
Possbile fix for bookmarks won't be replaced
</commit_message>
<xml_diff>
--- a/templates/flat_card.docx
+++ b/templates/flat_card.docx
@@ -33,7 +33,7 @@
           </w:tcPr>
           <w:p>
             <w:pPr>
-              <w:pStyle w:val="Style16"/>
+              <w:pStyle w:val="user2"/>
               <w:bidi w:val="0"/>
               <w:spacing w:lineRule="auto" w:line="240"/>
               <w:jc w:val="center"/>
@@ -102,7 +102,7 @@
           </w:p>
           <w:p>
             <w:pPr>
-              <w:pStyle w:val="Style16"/>
+              <w:pStyle w:val="user2"/>
               <w:bidi w:val="0"/>
               <w:spacing w:lineRule="auto" w:line="240"/>
               <w:jc w:val="center"/>
@@ -134,7 +134,7 @@
           </w:p>
           <w:p>
             <w:pPr>
-              <w:pStyle w:val="Style16"/>
+              <w:pStyle w:val="user2"/>
               <w:bidi w:val="0"/>
               <w:spacing w:lineRule="auto" w:line="240"/>
               <w:jc w:val="center"/>
@@ -155,7 +155,7 @@
           </w:p>
           <w:p>
             <w:pPr>
-              <w:pStyle w:val="Style16"/>
+              <w:pStyle w:val="user2"/>
               <w:bidi w:val="0"/>
               <w:spacing w:lineRule="auto" w:line="240"/>
               <w:jc w:val="center"/>
@@ -176,7 +176,7 @@
           </w:p>
           <w:p>
             <w:pPr>
-              <w:pStyle w:val="Style16"/>
+              <w:pStyle w:val="user2"/>
               <w:bidi w:val="0"/>
               <w:spacing w:lineRule="auto" w:line="240"/>
               <w:jc w:val="center"/>
@@ -197,7 +197,7 @@
           </w:p>
           <w:p>
             <w:pPr>
-              <w:pStyle w:val="Style16"/>
+              <w:pStyle w:val="user2"/>
               <w:bidi w:val="0"/>
               <w:spacing w:lineRule="auto" w:line="240"/>
               <w:jc w:val="center"/>
@@ -218,7 +218,7 @@
           </w:p>
           <w:p>
             <w:pPr>
-              <w:pStyle w:val="Style16"/>
+              <w:pStyle w:val="user2"/>
               <w:bidi w:val="0"/>
               <w:spacing w:lineRule="auto" w:line="240"/>
               <w:jc w:val="center"/>
@@ -250,7 +250,7 @@
           </w:p>
           <w:p>
             <w:pPr>
-              <w:pStyle w:val="Style16"/>
+              <w:pStyle w:val="user2"/>
               <w:bidi w:val="0"/>
               <w:spacing w:lineRule="auto" w:line="240"/>
               <w:jc w:val="center"/>
@@ -273,7 +273,7 @@
           </w:p>
           <w:p>
             <w:pPr>
-              <w:pStyle w:val="Style16"/>
+              <w:pStyle w:val="user2"/>
               <w:bidi w:val="0"/>
               <w:spacing w:lineRule="auto" w:line="240"/>
               <w:jc w:val="center"/>
@@ -296,7 +296,7 @@
           </w:p>
           <w:p>
             <w:pPr>
-              <w:pStyle w:val="Style16"/>
+              <w:pStyle w:val="user2"/>
               <w:bidi w:val="0"/>
               <w:spacing w:lineRule="auto" w:line="240"/>
               <w:jc w:val="center"/>
@@ -354,7 +354,7 @@
           </w:p>
           <w:p>
             <w:pPr>
-              <w:pStyle w:val="Style16"/>
+              <w:pStyle w:val="user2"/>
               <w:bidi w:val="0"/>
               <w:spacing w:lineRule="auto" w:line="240"/>
               <w:jc w:val="center"/>
@@ -424,7 +424,7 @@
           </w:tcPr>
           <w:p>
             <w:pPr>
-              <w:pStyle w:val="Style16"/>
+              <w:pStyle w:val="user2"/>
               <w:bidi w:val="0"/>
               <w:spacing w:lineRule="auto" w:line="240"/>
               <w:jc w:val="start"/>
@@ -455,7 +455,7 @@
           </w:tcPr>
           <w:p>
             <w:pPr>
-              <w:pStyle w:val="Style16"/>
+              <w:pStyle w:val="user2"/>
               <w:bidi w:val="0"/>
               <w:spacing w:lineRule="auto" w:line="240"/>
               <w:jc w:val="start"/>
@@ -475,7 +475,7 @@
           </w:p>
           <w:p>
             <w:pPr>
-              <w:pStyle w:val="Style16"/>
+              <w:pStyle w:val="user2"/>
               <w:bidi w:val="0"/>
               <w:spacing w:lineRule="auto" w:line="240"/>
               <w:jc w:val="start"/>
@@ -495,7 +495,7 @@
           </w:p>
           <w:p>
             <w:pPr>
-              <w:pStyle w:val="Style16"/>
+              <w:pStyle w:val="user2"/>
               <w:bidi w:val="0"/>
               <w:spacing w:lineRule="auto" w:line="240"/>
               <w:jc w:val="start"/>
@@ -515,7 +515,7 @@
           </w:p>
           <w:p>
             <w:pPr>
-              <w:pStyle w:val="Style16"/>
+              <w:pStyle w:val="user2"/>
               <w:bidi w:val="0"/>
               <w:spacing w:lineRule="auto" w:line="240"/>
               <w:jc w:val="start"/>
@@ -535,7 +535,7 @@
           </w:p>
           <w:p>
             <w:pPr>
-              <w:pStyle w:val="Style16"/>
+              <w:pStyle w:val="user2"/>
               <w:bidi w:val="0"/>
               <w:spacing w:lineRule="auto" w:line="240"/>
               <w:jc w:val="start"/>
@@ -552,7 +552,7 @@
           </w:p>
           <w:p>
             <w:pPr>
-              <w:pStyle w:val="Style16"/>
+              <w:pStyle w:val="user2"/>
               <w:bidi w:val="0"/>
               <w:spacing w:lineRule="auto" w:line="240"/>
               <w:jc w:val="start"/>
@@ -568,7 +568,7 @@
           </w:p>
           <w:p>
             <w:pPr>
-              <w:pStyle w:val="Style16"/>
+              <w:pStyle w:val="user2"/>
               <w:bidi w:val="0"/>
               <w:spacing w:lineRule="auto" w:line="240"/>
               <w:jc w:val="start"/>
@@ -580,31 +580,19 @@
               <w:rPr>
                 <w:lang w:val="en-US"/>
               </w:rPr>
-              <w:t>{{к</w:t>
+              <w:t/>
             </w:r>
             <w:r>
               <w:rPr>
                 <w:lang w:val="ru-RU"/>
               </w:rPr>
-              <w:t>ому:</w:t>
+              <w:t>{{кому:_адрес}}</w:t>
             </w:r>
             <w:r>
               <w:rPr>
                 <w:lang w:val="en-US"/>
               </w:rPr>
-              <w:t>_</w:t>
-            </w:r>
-            <w:r>
-              <w:rPr>
-                <w:lang w:val="ru-RU"/>
-              </w:rPr>
-              <w:t>адрес</w:t>
-            </w:r>
-            <w:r>
-              <w:rPr>
-                <w:lang w:val="en-US"/>
-              </w:rPr>
-              <w:t>}}</w:t>
+              <w:t/>
             </w:r>
           </w:p>
         </w:tc>
@@ -956,8 +944,8 @@
       <w:rFonts w:cs="Lucida Sans"/>
     </w:rPr>
   </w:style>
-  <w:style w:type="paragraph" w:styleId="Style16">
-    <w:name w:val="Содержимое таблицы"/>
+  <w:style w:type="paragraph" w:styleId="user2">
+    <w:name w:val="Содержимое таблицы (user)"/>
     <w:basedOn w:val="Normal"/>
     <w:qFormat/>
     <w:pPr>

</xml_diff>

<commit_message>
Update templates, remove some debug msgs
</commit_message>
<xml_diff>
--- a/templates/flat_card.docx
+++ b/templates/flat_card.docx
@@ -33,7 +33,7 @@
           </w:tcPr>
           <w:p>
             <w:pPr>
-              <w:pStyle w:val="user2"/>
+              <w:pStyle w:val="Style16"/>
               <w:bidi w:val="0"/>
               <w:spacing w:lineRule="auto" w:line="240"/>
               <w:jc w:val="center"/>
@@ -102,7 +102,7 @@
           </w:p>
           <w:p>
             <w:pPr>
-              <w:pStyle w:val="user2"/>
+              <w:pStyle w:val="Style16"/>
               <w:bidi w:val="0"/>
               <w:spacing w:lineRule="auto" w:line="240"/>
               <w:jc w:val="center"/>
@@ -134,7 +134,7 @@
           </w:p>
           <w:p>
             <w:pPr>
-              <w:pStyle w:val="user2"/>
+              <w:pStyle w:val="Style16"/>
               <w:bidi w:val="0"/>
               <w:spacing w:lineRule="auto" w:line="240"/>
               <w:jc w:val="center"/>
@@ -155,7 +155,7 @@
           </w:p>
           <w:p>
             <w:pPr>
-              <w:pStyle w:val="user2"/>
+              <w:pStyle w:val="Style16"/>
               <w:bidi w:val="0"/>
               <w:spacing w:lineRule="auto" w:line="240"/>
               <w:jc w:val="center"/>
@@ -176,7 +176,7 @@
           </w:p>
           <w:p>
             <w:pPr>
-              <w:pStyle w:val="user2"/>
+              <w:pStyle w:val="Style16"/>
               <w:bidi w:val="0"/>
               <w:spacing w:lineRule="auto" w:line="240"/>
               <w:jc w:val="center"/>
@@ -197,7 +197,7 @@
           </w:p>
           <w:p>
             <w:pPr>
-              <w:pStyle w:val="user2"/>
+              <w:pStyle w:val="Style16"/>
               <w:bidi w:val="0"/>
               <w:spacing w:lineRule="auto" w:line="240"/>
               <w:jc w:val="center"/>
@@ -218,7 +218,7 @@
           </w:p>
           <w:p>
             <w:pPr>
-              <w:pStyle w:val="user2"/>
+              <w:pStyle w:val="Style16"/>
               <w:bidi w:val="0"/>
               <w:spacing w:lineRule="auto" w:line="240"/>
               <w:jc w:val="center"/>
@@ -250,7 +250,7 @@
           </w:p>
           <w:p>
             <w:pPr>
-              <w:pStyle w:val="user2"/>
+              <w:pStyle w:val="Style16"/>
               <w:bidi w:val="0"/>
               <w:spacing w:lineRule="auto" w:line="240"/>
               <w:jc w:val="center"/>
@@ -273,7 +273,7 @@
           </w:p>
           <w:p>
             <w:pPr>
-              <w:pStyle w:val="user2"/>
+              <w:pStyle w:val="Style16"/>
               <w:bidi w:val="0"/>
               <w:spacing w:lineRule="auto" w:line="240"/>
               <w:jc w:val="center"/>
@@ -296,7 +296,7 @@
           </w:p>
           <w:p>
             <w:pPr>
-              <w:pStyle w:val="user2"/>
+              <w:pStyle w:val="Style16"/>
               <w:bidi w:val="0"/>
               <w:spacing w:lineRule="auto" w:line="240"/>
               <w:jc w:val="center"/>
@@ -354,7 +354,7 @@
           </w:p>
           <w:p>
             <w:pPr>
-              <w:pStyle w:val="user2"/>
+              <w:pStyle w:val="Style16"/>
               <w:bidi w:val="0"/>
               <w:spacing w:lineRule="auto" w:line="240"/>
               <w:jc w:val="center"/>
@@ -424,7 +424,7 @@
           </w:tcPr>
           <w:p>
             <w:pPr>
-              <w:pStyle w:val="user2"/>
+              <w:pStyle w:val="Style16"/>
               <w:bidi w:val="0"/>
               <w:spacing w:lineRule="auto" w:line="240"/>
               <w:jc w:val="start"/>
@@ -455,7 +455,7 @@
           </w:tcPr>
           <w:p>
             <w:pPr>
-              <w:pStyle w:val="user2"/>
+              <w:pStyle w:val="Style16"/>
               <w:bidi w:val="0"/>
               <w:spacing w:lineRule="auto" w:line="240"/>
               <w:jc w:val="start"/>
@@ -475,7 +475,7 @@
           </w:p>
           <w:p>
             <w:pPr>
-              <w:pStyle w:val="user2"/>
+              <w:pStyle w:val="Style16"/>
               <w:bidi w:val="0"/>
               <w:spacing w:lineRule="auto" w:line="240"/>
               <w:jc w:val="start"/>
@@ -495,7 +495,7 @@
           </w:p>
           <w:p>
             <w:pPr>
-              <w:pStyle w:val="user2"/>
+              <w:pStyle w:val="Style16"/>
               <w:bidi w:val="0"/>
               <w:spacing w:lineRule="auto" w:line="240"/>
               <w:jc w:val="start"/>
@@ -515,7 +515,7 @@
           </w:p>
           <w:p>
             <w:pPr>
-              <w:pStyle w:val="user2"/>
+              <w:pStyle w:val="Style16"/>
               <w:bidi w:val="0"/>
               <w:spacing w:lineRule="auto" w:line="240"/>
               <w:jc w:val="start"/>
@@ -535,7 +535,7 @@
           </w:p>
           <w:p>
             <w:pPr>
-              <w:pStyle w:val="user2"/>
+              <w:pStyle w:val="Style16"/>
               <w:bidi w:val="0"/>
               <w:spacing w:lineRule="auto" w:line="240"/>
               <w:jc w:val="start"/>
@@ -552,7 +552,7 @@
           </w:p>
           <w:p>
             <w:pPr>
-              <w:pStyle w:val="user2"/>
+              <w:pStyle w:val="Style16"/>
               <w:bidi w:val="0"/>
               <w:spacing w:lineRule="auto" w:line="240"/>
               <w:jc w:val="start"/>
@@ -568,7 +568,7 @@
           </w:p>
           <w:p>
             <w:pPr>
-              <w:pStyle w:val="user2"/>
+              <w:pStyle w:val="Style16"/>
               <w:bidi w:val="0"/>
               <w:spacing w:lineRule="auto" w:line="240"/>
               <w:jc w:val="start"/>
@@ -578,21 +578,9 @@
             </w:pPr>
             <w:r>
               <w:rPr>
-                <w:lang w:val="en-US"/>
-              </w:rPr>
-              <w:t/>
-            </w:r>
-            <w:r>
-              <w:rPr>
                 <w:lang w:val="ru-RU"/>
               </w:rPr>
               <w:t>{{кому:_адрес}}</w:t>
-            </w:r>
-            <w:r>
-              <w:rPr>
-                <w:lang w:val="en-US"/>
-              </w:rPr>
-              <w:t/>
             </w:r>
           </w:p>
         </w:tc>
@@ -746,7 +734,25 @@
           <w:u w:val="single"/>
           <w:lang w:val="ru-RU"/>
         </w:rPr>
-        <w:t>{{фио}}</w:t>
+        <w:t>{{фио</w:t>
+      </w:r>
+      <w:r>
+        <w:rPr>
+          <w:i w:val="false"/>
+          <w:iCs w:val="false"/>
+          <w:u w:val="single"/>
+          <w:lang w:val="ru-RU"/>
+        </w:rPr>
+        <w:t>_собственника</w:t>
+      </w:r>
+      <w:r>
+        <w:rPr>
+          <w:i w:val="false"/>
+          <w:iCs w:val="false"/>
+          <w:u w:val="single"/>
+          <w:lang w:val="ru-RU"/>
+        </w:rPr>
+        <w:t>}}</w:t>
       </w:r>
       <w:r>
         <w:rPr>
@@ -773,7 +779,25 @@
           <w:u w:val="single"/>
           <w:lang w:val="ru-RU"/>
         </w:rPr>
-        <w:t>{{дата_рождения}}</w:t>
+        <w:t>{{дата_рождения</w:t>
+      </w:r>
+      <w:r>
+        <w:rPr>
+          <w:i w:val="false"/>
+          <w:iCs w:val="false"/>
+          <w:u w:val="single"/>
+          <w:lang w:val="ru-RU"/>
+        </w:rPr>
+        <w:t>_собственника</w:t>
+      </w:r>
+      <w:r>
+        <w:rPr>
+          <w:i w:val="false"/>
+          <w:iCs w:val="false"/>
+          <w:u w:val="single"/>
+          <w:lang w:val="ru-RU"/>
+        </w:rPr>
+        <w:t>}}</w:t>
       </w:r>
       <w:r>
         <w:rPr>
@@ -800,7 +824,25 @@
           <w:u w:val="single"/>
           <w:lang w:val="ru-RU"/>
         </w:rPr>
-        <w:t>{{адрес}}</w:t>
+        <w:t>{{адрес</w:t>
+      </w:r>
+      <w:r>
+        <w:rPr>
+          <w:i w:val="false"/>
+          <w:iCs w:val="false"/>
+          <w:u w:val="single"/>
+          <w:lang w:val="ru-RU"/>
+        </w:rPr>
+        <w:t>_собственника</w:t>
+      </w:r>
+      <w:r>
+        <w:rPr>
+          <w:i w:val="false"/>
+          <w:iCs w:val="false"/>
+          <w:u w:val="single"/>
+          <w:lang w:val="ru-RU"/>
+        </w:rPr>
+        <w:t>}}</w:t>
       </w:r>
     </w:p>
     <w:sectPr>
@@ -944,8 +986,8 @@
       <w:rFonts w:cs="Lucida Sans"/>
     </w:rPr>
   </w:style>
-  <w:style w:type="paragraph" w:styleId="user2">
-    <w:name w:val="Содержимое таблицы (user)"/>
+  <w:style w:type="paragraph" w:styleId="Style16">
+    <w:name w:val="Содержимое таблицы"/>
     <w:basedOn w:val="Normal"/>
     <w:qFormat/>
     <w:pPr>

</xml_diff>

<commit_message>
Create menubar, add shortcuts
</commit_message>
<xml_diff>
--- a/templates/flat_card.docx
+++ b/templates/flat_card.docx
@@ -734,7 +734,7 @@
           <w:u w:val="single"/>
           <w:lang w:val="ru-RU"/>
         </w:rPr>
-        <w:t>{{фио</w:t>
+        <w:t/>
       </w:r>
       <w:r>
         <w:rPr>
@@ -743,7 +743,7 @@
           <w:u w:val="single"/>
           <w:lang w:val="ru-RU"/>
         </w:rPr>
-        <w:t>_собственника</w:t>
+        <w:t>{{фио_собственника}}</w:t>
       </w:r>
       <w:r>
         <w:rPr>
@@ -752,7 +752,7 @@
           <w:u w:val="single"/>
           <w:lang w:val="ru-RU"/>
         </w:rPr>
-        <w:t>}}</w:t>
+        <w:t/>
       </w:r>
       <w:r>
         <w:rPr>
@@ -779,7 +779,7 @@
           <w:u w:val="single"/>
           <w:lang w:val="ru-RU"/>
         </w:rPr>
-        <w:t>{{дата_рождения</w:t>
+        <w:t/>
       </w:r>
       <w:r>
         <w:rPr>
@@ -788,7 +788,7 @@
           <w:u w:val="single"/>
           <w:lang w:val="ru-RU"/>
         </w:rPr>
-        <w:t>_собственника</w:t>
+        <w:t>{{дата_рождения_собственника}}</w:t>
       </w:r>
       <w:r>
         <w:rPr>
@@ -797,7 +797,7 @@
           <w:u w:val="single"/>
           <w:lang w:val="ru-RU"/>
         </w:rPr>
-        <w:t>}}</w:t>
+        <w:t/>
       </w:r>
       <w:r>
         <w:rPr>
@@ -824,7 +824,7 @@
           <w:u w:val="single"/>
           <w:lang w:val="ru-RU"/>
         </w:rPr>
-        <w:t>{{адрес</w:t>
+        <w:t/>
       </w:r>
       <w:r>
         <w:rPr>
@@ -833,7 +833,7 @@
           <w:u w:val="single"/>
           <w:lang w:val="ru-RU"/>
         </w:rPr>
-        <w:t>_собственника</w:t>
+        <w:t>{{адрес_собственника}}</w:t>
       </w:r>
       <w:r>
         <w:rPr>
@@ -842,7 +842,7 @@
           <w:u w:val="single"/>
           <w:lang w:val="ru-RU"/>
         </w:rPr>
-        <w:t>}}</w:t>
+        <w:t/>
       </w:r>
     </w:p>
     <w:sectPr>

</xml_diff>